<commit_message>
Adventure Works Sales Dashboard
</commit_message>
<xml_diff>
--- a/wk2image.docx
+++ b/wk2image.docx
@@ -8,9 +8,17 @@
           <w:noProof/>
         </w:rPr>
         <w:drawing>
-          <wp:inline distT="0" distB="0" distL="0" distR="0" wp14:anchorId="017A4A69" wp14:editId="4B8560D5">
+          <wp:anchor distT="0" distB="0" distL="114300" distR="114300" simplePos="0" relativeHeight="251658240" behindDoc="0" locked="0" layoutInCell="1" allowOverlap="1" wp14:anchorId="017A4A69" wp14:editId="4D464ADC">
+            <wp:simplePos x="914400" y="914400"/>
+            <wp:positionH relativeFrom="column">
+              <wp:align>left</wp:align>
+            </wp:positionH>
+            <wp:positionV relativeFrom="paragraph">
+              <wp:align>top</wp:align>
+            </wp:positionV>
             <wp:extent cx="4572000" cy="2743200"/>
             <wp:effectExtent l="0" t="0" r="0" b="0"/>
+            <wp:wrapSquare wrapText="bothSides"/>
             <wp:docPr id="1989094775" name="Chart 1">
               <a:extLst xmlns:a="http://schemas.openxmlformats.org/drawingml/2006/main">
                 <a:ext uri="{FF2B5EF4-FFF2-40B4-BE49-F238E27FC236}">
@@ -24,65 +32,14 @@
                 <c:chart xmlns:c="http://schemas.openxmlformats.org/drawingml/2006/chart" xmlns:r="http://schemas.openxmlformats.org/officeDocument/2006/relationships" r:id="rId4"/>
               </a:graphicData>
             </a:graphic>
-          </wp:inline>
+          </wp:anchor>
         </w:drawing>
       </w:r>
-    </w:p>
-    <w:p>
-      <w:proofErr w:type="spellStart"/>
       <w:r>
-        <w:t>PowerBI</w:t>
-      </w:r>
-      <w:proofErr w:type="spellEnd"/>
-      <w:r>
-        <w:t xml:space="preserve"> Map</w:t>
+        <w:br w:type="textWrapping" w:clear="all"/>
       </w:r>
     </w:p>
-    <w:p>
-      <w:r>
-        <w:rPr>
-          <w:rStyle w:val="Title"/>
-          <w:noProof/>
-          <w:sz w:val="28"/>
-          <w:szCs w:val="28"/>
-        </w:rPr>
-        <w:drawing>
-          <wp:inline distT="0" distB="0" distL="0" distR="0" wp14:anchorId="3DEE4406" wp14:editId="349AEF53">
-            <wp:extent cx="5731510" cy="2642751"/>
-            <wp:effectExtent l="0" t="0" r="2540" b="5715"/>
-            <wp:docPr id="34718746" name="Picture 1"/>
-            <wp:cNvGraphicFramePr>
-              <a:graphicFrameLocks xmlns:a="http://schemas.openxmlformats.org/drawingml/2006/main" noChangeAspect="1"/>
-            </wp:cNvGraphicFramePr>
-            <a:graphic xmlns:a="http://schemas.openxmlformats.org/drawingml/2006/main">
-              <a:graphicData uri="http://schemas.openxmlformats.org/drawingml/2006/picture">
-                <pic:pic xmlns:pic="http://schemas.openxmlformats.org/drawingml/2006/picture">
-                  <pic:nvPicPr>
-                    <pic:cNvPr id="34718746" name=""/>
-                    <pic:cNvPicPr/>
-                  </pic:nvPicPr>
-                  <pic:blipFill>
-                    <a:blip r:embed="rId5"/>
-                    <a:stretch>
-                      <a:fillRect/>
-                    </a:stretch>
-                  </pic:blipFill>
-                  <pic:spPr>
-                    <a:xfrm>
-                      <a:off x="0" y="0"/>
-                      <a:ext cx="5731510" cy="2642751"/>
-                    </a:xfrm>
-                    <a:prstGeom prst="rect">
-                      <a:avLst/>
-                    </a:prstGeom>
-                  </pic:spPr>
-                </pic:pic>
-              </a:graphicData>
-            </a:graphic>
-          </wp:inline>
-        </w:drawing>
-      </w:r>
-    </w:p>
+    <w:p/>
     <w:sectPr>
       <w:pgSz w:w="11906" w:h="16838"/>
       <w:pgMar w:top="1440" w:right="1440" w:bottom="1440" w:left="1440" w:header="708" w:footer="708" w:gutter="0"/>
@@ -1266,86 +1223,6 @@
         <c:barDir val="col"/>
         <c:grouping val="clustered"/>
         <c:varyColors val="0"/>
-        <c:ser>
-          <c:idx val="0"/>
-          <c:order val="0"/>
-          <c:tx>
-            <c:strRef>
-              <c:f>'op effc'!$B$3</c:f>
-              <c:strCache>
-                <c:ptCount val="1"/>
-                <c:pt idx="0">
-                  <c:v>Total</c:v>
-                </c:pt>
-              </c:strCache>
-            </c:strRef>
-          </c:tx>
-          <c:spPr>
-            <a:solidFill>
-              <a:schemeClr val="accent1"/>
-            </a:solidFill>
-            <a:ln>
-              <a:noFill/>
-            </a:ln>
-            <a:effectLst/>
-          </c:spPr>
-          <c:invertIfNegative val="0"/>
-          <c:cat>
-            <c:strRef>
-              <c:f>'op effc'!$A$4:$A$9</c:f>
-              <c:strCache>
-                <c:ptCount val="6"/>
-                <c:pt idx="0">
-                  <c:v>2017</c:v>
-                </c:pt>
-                <c:pt idx="1">
-                  <c:v>2018</c:v>
-                </c:pt>
-                <c:pt idx="2">
-                  <c:v>2019</c:v>
-                </c:pt>
-                <c:pt idx="3">
-                  <c:v>2020</c:v>
-                </c:pt>
-                <c:pt idx="4">
-                  <c:v>2021</c:v>
-                </c:pt>
-                <c:pt idx="5">
-                  <c:v>Grand Total</c:v>
-                </c:pt>
-              </c:strCache>
-            </c:strRef>
-          </c:cat>
-          <c:val>
-            <c:numRef>
-              <c:f>'op effc'!$B$4:$B$9</c:f>
-              <c:numCache>
-                <c:formatCode>0</c:formatCode>
-                <c:ptCount val="6"/>
-                <c:pt idx="0">
-                  <c:v>60.487751307865068</c:v>
-                </c:pt>
-                <c:pt idx="1">
-                  <c:v>54.502125275569369</c:v>
-                </c:pt>
-                <c:pt idx="2">
-                  <c:v>52.773731550828693</c:v>
-                </c:pt>
-                <c:pt idx="3">
-                  <c:v>55.770582456135344</c:v>
-                </c:pt>
-                <c:pt idx="4">
-                  <c:v>56.344830270896516</c:v>
-                </c:pt>
-              </c:numCache>
-            </c:numRef>
-          </c:val>
-          <c:extLst>
-            <c:ext xmlns:c16="http://schemas.microsoft.com/office/drawing/2014/chart" uri="{C3380CC4-5D6E-409C-BE32-E72D297353CC}">
-              <c16:uniqueId val="{00000000-E69C-403D-8453-D0069674F2FE}"/>
-            </c:ext>
-          </c:extLst>
-        </c:ser>
         <c:dLbls>
           <c:showLegendKey val="0"/>
           <c:showVal val="0"/>
@@ -1700,6 +1577,7 @@
   <c:externalData r:id="rId3">
     <c:autoUpdate val="0"/>
   </c:externalData>
+  <c:userShapes r:id="rId4"/>
   <c:extLst>
     <c:ext xmlns:c14="http://schemas.microsoft.com/office/drawing/2007/8/2/chart" uri="{781A3756-C4B2-4CAC-9D66-4F8BD8637D16}">
       <c14:pivotOptions>
@@ -2260,6 +2138,44 @@
     </cs:spPr>
   </cs:wall>
 </cs:chartStyle>
+</file>
+
+<file path=word/drawings/drawing1.xml><?xml version="1.0" encoding="utf-8"?>
+<c:userShapes xmlns:c="http://schemas.openxmlformats.org/drawingml/2006/chart">
+  <cdr:relSizeAnchor xmlns:cdr="http://schemas.openxmlformats.org/drawingml/2006/chartDrawing">
+    <cdr:from>
+      <cdr:x>0.0125</cdr:x>
+      <cdr:y>0</cdr:y>
+    </cdr:from>
+    <cdr:to>
+      <cdr:x>0.98722</cdr:x>
+      <cdr:y>1</cdr:y>
+    </cdr:to>
+    <cdr:pic>
+      <cdr:nvPicPr>
+        <cdr:cNvPr id="2" name="Picture 1"/>
+        <cdr:cNvPicPr>
+          <a:picLocks xmlns:a="http://schemas.openxmlformats.org/drawingml/2006/main" noChangeAspect="1"/>
+        </cdr:cNvPicPr>
+      </cdr:nvPicPr>
+      <cdr:blipFill>
+        <a:blip xmlns:a="http://schemas.openxmlformats.org/drawingml/2006/main" xmlns:r="http://schemas.openxmlformats.org/officeDocument/2006/relationships" r:embed="rId1"/>
+        <a:stretch xmlns:a="http://schemas.openxmlformats.org/drawingml/2006/main">
+          <a:fillRect/>
+        </a:stretch>
+      </cdr:blipFill>
+      <cdr:spPr>
+        <a:xfrm xmlns:a="http://schemas.openxmlformats.org/drawingml/2006/main">
+          <a:off x="57150" y="-914400"/>
+          <a:ext cx="4456430" cy="2743200"/>
+        </a:xfrm>
+        <a:prstGeom xmlns:a="http://schemas.openxmlformats.org/drawingml/2006/main" prst="rect">
+          <a:avLst/>
+        </a:prstGeom>
+      </cdr:spPr>
+    </cdr:pic>
+  </cdr:relSizeAnchor>
+</c:userShapes>
 </file>
 
 <file path=word/theme/theme1.xml><?xml version="1.0" encoding="utf-8"?>

</xml_diff>